<commit_message>
Update document : Story_统计信息收集.docx
git-svn-id: http://192.168.20.11/sequoiadb/trunk@29469 6121f079-4a18-41d3-8c30-8870a322f2c2
</commit_message>
<xml_diff>
--- a/internal_doc/03.开发设计/性能/Story_统计信息收集.docx
+++ b/internal_doc/03.开发设计/性能/Story_统计信息收集.docx
@@ -131,9 +131,6 @@
             <w:pPr>
               <w:ind w:left="0"/>
               <w:jc w:val="left"/>
-              <w:rPr>
-                <w:rFonts w:hint="eastAsia"/>
-              </w:rPr>
             </w:pPr>
             <w:r>
               <w:rPr>
@@ -151,9 +148,6 @@
             <w:pPr>
               <w:ind w:left="0"/>
               <w:jc w:val="left"/>
-              <w:rPr>
-                <w:rFonts w:hint="eastAsia"/>
-              </w:rPr>
             </w:pPr>
             <w:r>
               <w:rPr>
@@ -1370,7 +1364,6 @@
             <w:pPr>
               <w:ind w:left="0"/>
               <w:rPr>
-                <w:rFonts w:hint="eastAsia"/>
                 <w:sz w:val="13"/>
                 <w:szCs w:val="13"/>
               </w:rPr>
@@ -1512,7 +1505,7 @@
                 <w:sz w:val="13"/>
                 <w:szCs w:val="13"/>
               </w:rPr>
-              <w:t>SampleNumber</w:t>
+              <w:t>SampleNum</w:t>
             </w:r>
           </w:p>
         </w:tc>
@@ -15075,9 +15068,6 @@
           <w:numId w:val="29"/>
         </w:numPr>
         <w:ind w:firstLineChars="0"/>
-        <w:rPr>
-          <w:rFonts w:hint="eastAsia"/>
-        </w:rPr>
       </w:pPr>
       <w:r>
         <w:rPr>
@@ -15196,9 +15186,6 @@
           <w:numId w:val="29"/>
         </w:numPr>
         <w:ind w:firstLineChars="0"/>
-        <w:rPr>
-          <w:rFonts w:hint="eastAsia"/>
-        </w:rPr>
       </w:pPr>
       <w:r>
         <w:rPr>
@@ -15216,7 +15203,7 @@
         <w:rPr>
           <w:rFonts w:hint="eastAsia"/>
         </w:rPr>
-        <w:t>3</w:t>
+        <w:t>5</w:t>
       </w:r>
       <w:r>
         <w:rPr>
@@ -15263,6 +15250,24 @@
           <w:rFonts w:hint="eastAsia"/>
         </w:rPr>
         <w:t>日志</w:t>
+      </w:r>
+      <w:r>
+        <w:rPr>
+          <w:rFonts w:hint="eastAsia"/>
+        </w:rPr>
+        <w:t>(</w:t>
+      </w:r>
+      <w:r>
+        <w:rPr>
+          <w:rFonts w:hint="eastAsia"/>
+        </w:rPr>
+        <w:t>见下一节</w:t>
+      </w:r>
+      <w:r>
+        <w:rPr>
+          <w:rFonts w:hint="eastAsia"/>
+        </w:rPr>
+        <w:t>)</w:t>
       </w:r>
     </w:p>
     <w:p/>
@@ -15333,9 +15338,6 @@
           <w:p>
             <w:pPr>
               <w:ind w:left="0"/>
-              <w:rPr>
-                <w:rFonts w:hint="eastAsia"/>
-              </w:rPr>
             </w:pPr>
             <w:r>
               <w:rPr>
@@ -15430,19 +15432,8 @@
         </w:tc>
       </w:tr>
     </w:tbl>
-    <w:p>
-      <w:pPr>
-        <w:rPr>
-          <w:rFonts w:hint="eastAsia"/>
-        </w:rPr>
-      </w:pPr>
-    </w:p>
-    <w:p>
-      <w:pPr>
-        <w:rPr>
-          <w:rFonts w:hint="eastAsia"/>
-        </w:rPr>
-      </w:pPr>
+    <w:p/>
+    <w:p>
       <w:r>
         <w:rPr>
           <w:rFonts w:hint="eastAsia"/>
@@ -15470,9 +15461,6 @@
           <w:numId w:val="34"/>
         </w:numPr>
         <w:ind w:firstLineChars="0"/>
-        <w:rPr>
-          <w:rFonts w:hint="eastAsia"/>
-        </w:rPr>
       </w:pPr>
       <w:r>
         <w:rPr>
@@ -15501,9 +15489,6 @@
           <w:numId w:val="34"/>
         </w:numPr>
         <w:ind w:firstLineChars="0"/>
-        <w:rPr>
-          <w:rFonts w:hint="eastAsia"/>
-        </w:rPr>
       </w:pPr>
       <w:r>
         <w:rPr>
@@ -15538,9 +15523,6 @@
           <w:numId w:val="34"/>
         </w:numPr>
         <w:ind w:firstLineChars="0"/>
-        <w:rPr>
-          <w:rFonts w:hint="eastAsia"/>
-        </w:rPr>
       </w:pPr>
       <w:r>
         <w:rPr>
@@ -15575,9 +15557,6 @@
           <w:numId w:val="34"/>
         </w:numPr>
         <w:ind w:firstLineChars="0"/>
-        <w:rPr>
-          <w:rFonts w:hint="eastAsia"/>
-        </w:rPr>
       </w:pPr>
       <w:r>
         <w:rPr>
@@ -15612,9 +15591,6 @@
           <w:numId w:val="34"/>
         </w:numPr>
         <w:ind w:firstLineChars="0"/>
-        <w:rPr>
-          <w:rFonts w:hint="eastAsia"/>
-        </w:rPr>
       </w:pPr>
       <w:r>
         <w:rPr>
@@ -15649,9 +15625,6 @@
           <w:numId w:val="34"/>
         </w:numPr>
         <w:ind w:firstLineChars="0"/>
-        <w:rPr>
-          <w:rFonts w:hint="eastAsia"/>
-        </w:rPr>
       </w:pPr>
       <w:r>
         <w:rPr>
@@ -15668,9 +15641,6 @@
           <w:numId w:val="34"/>
         </w:numPr>
         <w:ind w:firstLineChars="0"/>
-        <w:rPr>
-          <w:rFonts w:hint="eastAsia"/>
-        </w:rPr>
       </w:pPr>
       <w:r>
         <w:rPr>
@@ -15705,9 +15675,6 @@
           <w:numId w:val="34"/>
         </w:numPr>
         <w:ind w:firstLineChars="0"/>
-        <w:rPr>
-          <w:rFonts w:hint="eastAsia"/>
-        </w:rPr>
       </w:pPr>
       <w:r>
         <w:rPr>
@@ -15742,9 +15709,6 @@
           <w:numId w:val="34"/>
         </w:numPr>
         <w:ind w:firstLineChars="0"/>
-        <w:rPr>
-          <w:rFonts w:hint="eastAsia"/>
-        </w:rPr>
       </w:pPr>
       <w:r>
         <w:rPr>
@@ -15779,9 +15743,6 @@
           <w:numId w:val="34"/>
         </w:numPr>
         <w:ind w:firstLineChars="0"/>
-        <w:rPr>
-          <w:rFonts w:hint="eastAsia"/>
-        </w:rPr>
       </w:pPr>
       <w:r>
         <w:rPr>
@@ -15816,9 +15777,6 @@
           <w:numId w:val="34"/>
         </w:numPr>
         <w:ind w:firstLineChars="0"/>
-        <w:rPr>
-          <w:rFonts w:hint="eastAsia"/>
-        </w:rPr>
       </w:pPr>
       <w:r>
         <w:rPr>
@@ -15841,9 +15799,6 @@
           <w:numId w:val="34"/>
         </w:numPr>
         <w:ind w:firstLineChars="0"/>
-        <w:rPr>
-          <w:rFonts w:hint="eastAsia"/>
-        </w:rPr>
       </w:pPr>
       <w:r>
         <w:rPr>
@@ -18222,10 +18177,52 @@
             <w:pPr>
               <w:ind w:left="0"/>
               <w:rPr>
+                <w:rFonts w:hint="eastAsia"/>
                 <w:sz w:val="18"/>
                 <w:szCs w:val="18"/>
               </w:rPr>
             </w:pPr>
+            <w:r>
+              <w:rPr>
+                <w:rFonts w:hint="eastAsia"/>
+                <w:sz w:val="18"/>
+                <w:szCs w:val="18"/>
+              </w:rPr>
+              <w:t>延迟一天，添加</w:t>
+            </w:r>
+            <w:r>
+              <w:rPr>
+                <w:rFonts w:hint="eastAsia"/>
+                <w:sz w:val="18"/>
+                <w:szCs w:val="18"/>
+              </w:rPr>
+              <w:t>CLEAR</w:t>
+            </w:r>
+            <w:r>
+              <w:rPr>
+                <w:rFonts w:hint="eastAsia"/>
+                <w:sz w:val="18"/>
+                <w:szCs w:val="18"/>
+              </w:rPr>
+              <w:t>模式</w:t>
+            </w:r>
+          </w:p>
+          <w:p>
+            <w:pPr>
+              <w:ind w:left="0"/>
+              <w:rPr>
+                <w:sz w:val="18"/>
+                <w:szCs w:val="18"/>
+              </w:rPr>
+            </w:pPr>
+            <w:r>
+              <w:rPr>
+                <w:rFonts w:hint="eastAsia"/>
+                <w:sz w:val="18"/>
+                <w:szCs w:val="18"/>
+              </w:rPr>
+              <w:t>已完成</w:t>
+            </w:r>
           </w:p>
         </w:tc>
       </w:tr>
@@ -18282,12 +18279,16 @@
               <w:jc w:val="left"/>
               <w:rPr>
                 <w:b/>
+                <w:sz w:val="13"/>
+                <w:szCs w:val="13"/>
               </w:rPr>
             </w:pPr>
             <w:r>
               <w:rPr>
                 <w:rFonts w:hint="eastAsia"/>
                 <w:b/>
+                <w:sz w:val="13"/>
+                <w:szCs w:val="13"/>
               </w:rPr>
               <w:t>编号</w:t>
             </w:r>
@@ -18303,12 +18304,16 @@
               <w:jc w:val="left"/>
               <w:rPr>
                 <w:b/>
+                <w:sz w:val="13"/>
+                <w:szCs w:val="13"/>
               </w:rPr>
             </w:pPr>
             <w:r>
               <w:rPr>
                 <w:rFonts w:hint="eastAsia"/>
                 <w:b/>
+                <w:sz w:val="13"/>
+                <w:szCs w:val="13"/>
               </w:rPr>
               <w:t>标题</w:t>
             </w:r>
@@ -18324,12 +18329,16 @@
               <w:jc w:val="left"/>
               <w:rPr>
                 <w:b/>
+                <w:sz w:val="13"/>
+                <w:szCs w:val="13"/>
               </w:rPr>
             </w:pPr>
             <w:r>
               <w:rPr>
                 <w:rFonts w:hint="eastAsia"/>
                 <w:b/>
+                <w:sz w:val="13"/>
+                <w:szCs w:val="13"/>
               </w:rPr>
               <w:t>描述</w:t>
             </w:r>
@@ -18345,7 +18354,19 @@
             <w:pPr>
               <w:ind w:left="0"/>
               <w:jc w:val="left"/>
-            </w:pPr>
+              <w:rPr>
+                <w:sz w:val="13"/>
+                <w:szCs w:val="13"/>
+              </w:rPr>
+            </w:pPr>
+            <w:r>
+              <w:rPr>
+                <w:rFonts w:hint="eastAsia"/>
+                <w:sz w:val="13"/>
+                <w:szCs w:val="13"/>
+              </w:rPr>
+              <w:t>001</w:t>
+            </w:r>
           </w:p>
         </w:tc>
         <w:tc>
@@ -18356,7 +18377,27 @@
             <w:pPr>
               <w:ind w:left="0"/>
               <w:jc w:val="left"/>
-            </w:pPr>
+              <w:rPr>
+                <w:sz w:val="13"/>
+                <w:szCs w:val="13"/>
+              </w:rPr>
+            </w:pPr>
+            <w:r>
+              <w:rPr>
+                <w:rFonts w:hint="eastAsia"/>
+                <w:sz w:val="13"/>
+                <w:szCs w:val="13"/>
+              </w:rPr>
+              <w:t>FULL</w:t>
+            </w:r>
+            <w:r>
+              <w:rPr>
+                <w:rFonts w:hint="eastAsia"/>
+                <w:sz w:val="13"/>
+                <w:szCs w:val="13"/>
+              </w:rPr>
+              <w:t>模式</w:t>
+            </w:r>
           </w:p>
         </w:tc>
         <w:tc>
@@ -18367,7 +18408,117 @@
             <w:pPr>
               <w:ind w:left="0"/>
               <w:jc w:val="left"/>
-            </w:pPr>
+              <w:rPr>
+                <w:sz w:val="13"/>
+                <w:szCs w:val="13"/>
+              </w:rPr>
+            </w:pPr>
+            <w:r>
+              <w:rPr>
+                <w:rFonts w:hint="eastAsia"/>
+                <w:sz w:val="13"/>
+                <w:szCs w:val="13"/>
+              </w:rPr>
+              <w:t>对所有数据进行</w:t>
+            </w:r>
+            <w:r>
+              <w:rPr>
+                <w:rFonts w:hint="eastAsia"/>
+                <w:sz w:val="13"/>
+                <w:szCs w:val="13"/>
+              </w:rPr>
+              <w:t>analyze</w:t>
+            </w:r>
+          </w:p>
+        </w:tc>
+      </w:tr>
+      <w:tr>
+        <w:tc>
+          <w:tcPr>
+            <w:tcW w:w="885" w:type="dxa"/>
+          </w:tcPr>
+          <w:p>
+            <w:pPr>
+              <w:ind w:left="0"/>
+              <w:jc w:val="left"/>
+              <w:rPr>
+                <w:rFonts w:hint="eastAsia"/>
+                <w:sz w:val="13"/>
+                <w:szCs w:val="13"/>
+              </w:rPr>
+            </w:pPr>
+            <w:r>
+              <w:rPr>
+                <w:rFonts w:hint="eastAsia"/>
+                <w:sz w:val="13"/>
+                <w:szCs w:val="13"/>
+              </w:rPr>
+              <w:t>002</w:t>
+            </w:r>
+          </w:p>
+        </w:tc>
+        <w:tc>
+          <w:tcPr>
+            <w:tcW w:w="2552" w:type="dxa"/>
+          </w:tcPr>
+          <w:p>
+            <w:pPr>
+              <w:ind w:left="0"/>
+              <w:jc w:val="left"/>
+              <w:rPr>
+                <w:rFonts w:hint="eastAsia"/>
+                <w:sz w:val="13"/>
+                <w:szCs w:val="13"/>
+              </w:rPr>
+            </w:pPr>
+            <w:r>
+              <w:rPr>
+                <w:rFonts w:hint="eastAsia"/>
+                <w:sz w:val="13"/>
+                <w:szCs w:val="13"/>
+              </w:rPr>
+              <w:t>Histogram</w:t>
+            </w:r>
+          </w:p>
+        </w:tc>
+        <w:tc>
+          <w:tcPr>
+            <w:tcW w:w="4728" w:type="dxa"/>
+          </w:tcPr>
+          <w:p>
+            <w:pPr>
+              <w:ind w:left="0"/>
+              <w:jc w:val="left"/>
+              <w:rPr>
+                <w:rFonts w:hint="eastAsia"/>
+                <w:sz w:val="13"/>
+                <w:szCs w:val="13"/>
+              </w:rPr>
+            </w:pPr>
+            <w:r>
+              <w:rPr>
+                <w:rFonts w:hint="eastAsia"/>
+                <w:sz w:val="13"/>
+                <w:szCs w:val="13"/>
+              </w:rPr>
+              <w:t>生成等高直方图，与</w:t>
+            </w:r>
+            <w:r>
+              <w:rPr>
+                <w:rFonts w:hint="eastAsia"/>
+                <w:sz w:val="13"/>
+                <w:szCs w:val="13"/>
+              </w:rPr>
+              <w:t>MCV</w:t>
+            </w:r>
+            <w:r>
+              <w:rPr>
+                <w:rFonts w:hint="eastAsia"/>
+                <w:sz w:val="13"/>
+                <w:szCs w:val="13"/>
+              </w:rPr>
+              <w:t>结合使用</w:t>
+            </w:r>
           </w:p>
         </w:tc>
       </w:tr>
@@ -18536,6 +18687,7 @@
                 <w:sz w:val="13"/>
                 <w:szCs w:val="13"/>
               </w:rPr>
+              <w:lastRenderedPageBreak/>
               <w:t>用例编号</w:t>
             </w:r>
           </w:p>
@@ -18639,7 +18791,6 @@
                 <w:sz w:val="13"/>
                 <w:szCs w:val="13"/>
               </w:rPr>
-              <w:lastRenderedPageBreak/>
               <w:t>stat.001</w:t>
             </w:r>
           </w:p>

</xml_diff>